<commit_message>
Brief updated and feedback added
</commit_message>
<xml_diff>
--- a/Project Proposal/GAM708 Proposal Form.docx
+++ b/Project Proposal/GAM708 Proposal Form.docx
@@ -1520,7 +1520,29 @@
                 <w:sz w:val="17"/>
                 <w:szCs w:val="17"/>
               </w:rPr>
-              <w:t>How will you investigate your research question? Describe the methods, tools, and processes you will use. Justify your choices in relation to your artefact type and research question.</w:t>
+              <w:t xml:space="preserve">How will you investigate your research question? </w:t>
+            </w:r>
+            <w:proofErr w:type="gramStart"/>
+            <w:r>
+              <w:rPr>
+                <w:i/>
+                <w:iCs/>
+                <w:color w:val="888888"/>
+                <w:sz w:val="17"/>
+                <w:szCs w:val="17"/>
+              </w:rPr>
+              <w:t>Describe</w:t>
+            </w:r>
+            <w:proofErr w:type="gramEnd"/>
+            <w:r>
+              <w:rPr>
+                <w:i/>
+                <w:iCs/>
+                <w:color w:val="888888"/>
+                <w:sz w:val="17"/>
+                <w:szCs w:val="17"/>
+              </w:rPr>
+              <w:t xml:space="preserve"> the methods, tools, and processes you will use. Justify your choices in relation to your artefact type and research question.</w:t>
             </w:r>
           </w:p>
           <w:p>
@@ -1787,7 +1809,29 @@
                 <w:sz w:val="17"/>
                 <w:szCs w:val="17"/>
               </w:rPr>
-              <w:t>Identify any legal, social, ethical, or professional issues associated with your project. If a full ethics application is required, note its current status. If not, briefly explain why no significant ethical risks are present.</w:t>
+              <w:t xml:space="preserve">Identify any legal, social, ethical, or professional issues associated with your project. If a full ethics application is required, note its </w:t>
+            </w:r>
+            <w:proofErr w:type="gramStart"/>
+            <w:r>
+              <w:rPr>
+                <w:i/>
+                <w:iCs/>
+                <w:color w:val="888888"/>
+                <w:sz w:val="17"/>
+                <w:szCs w:val="17"/>
+              </w:rPr>
+              <w:t>current status</w:t>
+            </w:r>
+            <w:proofErr w:type="gramEnd"/>
+            <w:r>
+              <w:rPr>
+                <w:i/>
+                <w:iCs/>
+                <w:color w:val="888888"/>
+                <w:sz w:val="17"/>
+                <w:szCs w:val="17"/>
+              </w:rPr>
+              <w:t>. If not, briefly explain why no significant ethical risks are present.</w:t>
             </w:r>
           </w:p>
           <w:p>
@@ -3535,8 +3579,6 @@
           <w:p>
             <w:pPr>
               <w:spacing w:after="120"/>
-            </w:pPr>
-            <w:r>
               <w:rPr>
                 <w:i/>
                 <w:iCs/>
@@ -3544,15 +3586,67 @@
                 <w:sz w:val="17"/>
                 <w:szCs w:val="17"/>
               </w:rPr>
+            </w:pPr>
+            <w:r>
+              <w:rPr>
+                <w:i/>
+                <w:iCs/>
+                <w:color w:val="888888"/>
+                <w:sz w:val="17"/>
+                <w:szCs w:val="17"/>
+              </w:rPr>
               <w:t>Please provide feedback on each section of the proposal, including specific comment on the proposed process documentation method. This form should be completed at or following the first supervision session after the proposal presentation.</w:t>
             </w:r>
           </w:p>
           <w:p>
             <w:pPr>
+              <w:spacing w:after="120"/>
+              <w:rPr>
+                <w:i/>
+                <w:iCs/>
+                <w:color w:val="888888"/>
+                <w:sz w:val="17"/>
+                <w:szCs w:val="17"/>
+              </w:rPr>
+            </w:pPr>
+          </w:p>
+          <w:p>
+            <w:pPr>
+              <w:spacing w:after="120"/>
+            </w:pPr>
+            <w:r>
+              <w:rPr>
+                <w:i/>
+                <w:iCs/>
+                <w:color w:val="888888"/>
+                <w:sz w:val="17"/>
+                <w:szCs w:val="17"/>
+              </w:rPr>
+              <w:t>(04/06/2026)</w:t>
+            </w:r>
+          </w:p>
+          <w:p>
+            <w:pPr>
               <w:spacing w:after="200"/>
             </w:pPr>
             <w:r>
-              <w:t xml:space="preserve"> </w:t>
+              <w:t xml:space="preserve">I read your proposal, which has many good aspects. The research question seems well-defined, and the artefacts to be produced are ambitious (4 prototypes) but sensible. I do think that the primary form this research will take is a software product. You can write a written article if you want to, but I don’t think this is required. Rather, I would recommend that you do a more thorough lit review of the available articles on level design and player navigation (bearing in mind the thousands of results that this query returned from Google Scholar). Add a few of the most relevant sources that you find to your proposal </w:t>
+            </w:r>
+            <w:proofErr w:type="gramStart"/>
+            <w:r>
+              <w:t>form, and</w:t>
+            </w:r>
+            <w:proofErr w:type="gramEnd"/>
+            <w:r>
+              <w:t xml:space="preserve"> keep investigating relevant literature and context as you work on your artefacts. I would then use this lit review and the contextual review from GDC Vault and other sources to inform your work, i.e. to help you to make artefacts that are at the cutting edge of contemporary practice and therefore able to help you to test the best practices available. From my perspective, the vlogs are an appropriate form of project documentation if your audience is indie developers, and these vlogs are sufficient as project documentation </w:t>
+            </w:r>
+            <w:proofErr w:type="gramStart"/>
+            <w:r>
+              <w:t>as long as</w:t>
+            </w:r>
+            <w:proofErr w:type="gramEnd"/>
+            <w:r>
+              <w:t xml:space="preserve"> you reference the articles and talks from your contextual review in relation to your own work. I wonder if it makes sense to do a fourth prototype combining all navigation techniques, since it would seem intuitively that a combination of lighting, space, and audio is almost certain to be more effective than any one of these strategies in isolation. Perhaps a sub-question could be *how* to most effectively combine these guidance techniques rather than *whether* to combine them.</w:t>
             </w:r>
           </w:p>
           <w:p>
@@ -5411,7 +5505,6 @@
   <w:style w:type="character" w:default="1" w:styleId="DefaultParagraphFont">
     <w:name w:val="Default Paragraph Font"/>
     <w:uiPriority w:val="1"/>
-    <w:semiHidden/>
     <w:unhideWhenUsed/>
   </w:style>
   <w:style w:type="table" w:default="1" w:styleId="TableNormal">

</xml_diff>

<commit_message>
Finished proposal for now
</commit_message>
<xml_diff>
--- a/Project Proposal/GAM708 Proposal Form.docx
+++ b/Project Proposal/GAM708 Proposal Form.docx
@@ -869,7 +869,15 @@
                 <w:sz w:val="18"/>
                 <w:szCs w:val="18"/>
               </w:rPr>
-              <w:t xml:space="preserve">Software product / Written dissertation </w:t>
+              <w:t xml:space="preserve">Software product </w:t>
+            </w:r>
+            <w:r>
+              <w:rPr>
+                <w:color w:val="auto"/>
+                <w:sz w:val="18"/>
+                <w:szCs w:val="18"/>
+              </w:rPr>
+              <w:t>/ lit review?</w:t>
             </w:r>
           </w:p>
         </w:tc>
@@ -1128,11 +1136,6 @@
             <w:pPr>
               <w:spacing w:after="200"/>
             </w:pPr>
-          </w:p>
-          <w:p>
-            <w:pPr>
-              <w:spacing w:after="200"/>
-            </w:pPr>
             <w:r>
               <w:t>This project will build upon existing research and industry practices by investigating which environmental design techniques are most effective at influencing player navigation and decision making without explicit guidance systems. The findings aim to contribute practical recommendations for game designers seeking to create more immersive and intuitive player experiences.</w:t>
             </w:r>
@@ -1307,6 +1310,42 @@
                 <w:bCs/>
                 <w:u w:val="single"/>
               </w:rPr>
+              <w:t xml:space="preserve">Articles </w:t>
+            </w:r>
+          </w:p>
+          <w:p>
+            <w:pPr>
+              <w:spacing w:before="60" w:after="60"/>
+            </w:pPr>
+            <w:hyperlink r:id="rId8" w:history="1">
+              <w:r>
+                <w:rPr>
+                  <w:rStyle w:val="Hyperlink"/>
+                </w:rPr>
+                <w:t>The influence of urban configuration on wayfinding propensity</w:t>
+              </w:r>
+            </w:hyperlink>
+          </w:p>
+          <w:p>
+            <w:pPr>
+              <w:spacing w:before="60" w:after="60"/>
+            </w:pPr>
+          </w:p>
+          <w:p>
+            <w:pPr>
+              <w:spacing w:before="60" w:after="60"/>
+              <w:rPr>
+                <w:b/>
+                <w:bCs/>
+                <w:u w:val="single"/>
+              </w:rPr>
+            </w:pPr>
+            <w:r>
+              <w:rPr>
+                <w:b/>
+                <w:bCs/>
+                <w:u w:val="single"/>
+              </w:rPr>
               <w:t>Videos</w:t>
             </w:r>
           </w:p>
@@ -1377,7 +1416,6 @@
               <w:spacing w:after="200"/>
             </w:pPr>
             <w:r>
-              <w:lastRenderedPageBreak/>
               <w:t>Portal</w:t>
             </w:r>
           </w:p>
@@ -1555,7 +1593,7 @@
               <w:spacing w:after="200"/>
             </w:pPr>
             <w:r>
-              <w:t xml:space="preserve">I plan on watching and reading numerous academic and professional pieces that are relevant to my question. I will keep note of what I consider to be the most important and relevant sections that I will use to directly influence my research. </w:t>
+              <w:t xml:space="preserve">I will investigate my research question through a combination of literature review, contextual analysis, prototype development, and user testing. </w:t>
             </w:r>
           </w:p>
           <w:p>
@@ -1563,29 +1601,32 @@
               <w:spacing w:after="200"/>
             </w:pPr>
             <w:r>
-              <w:t xml:space="preserve">I plan to take my findings and use this to build multiple </w:t>
-            </w:r>
-            <w:r>
-              <w:t>small-scale</w:t>
-            </w:r>
-            <w:r>
-              <w:t xml:space="preserve"> artefacts that directly uses the findings of my research. This should</w:t>
-            </w:r>
-            <w:r>
-              <w:t xml:space="preserve"> help visualise what I am talking about in my article, as well as I will be able to conduct user testing and get feedback that will either prove the artefacts to be effective, or not.</w:t>
+              <w:t>The project will begin with a thorough review of academic literature relating to player navigation, wayfinding, environmental storytelling, and level design. This research will be supported by an analysis of industry sources, including GDC presentations, developer talks, and professional articles. The aim of this research phase is to identify current best practices and establish an existing foundation for the project.</w:t>
             </w:r>
           </w:p>
           <w:p>
             <w:pPr>
               <w:spacing w:after="200"/>
             </w:pPr>
+            <w:r>
+              <w:t xml:space="preserve">The findings from the literature and contextual review will influence the development of a series of small-scale playable prototypes created in unreal engine 5 or Unity </w:t>
+            </w:r>
+            <w:r>
+              <w:rPr>
+                <w:highlight w:val="red"/>
+              </w:rPr>
+              <w:t>(need to confirm this asap)</w:t>
+            </w:r>
+            <w:r>
+              <w:t>. Each prototype will explore a different environmental guidance technique, such as lighting, landmarks, and audio cues. Rather than investigating whether guidance techniques should be combined, the project will also explore how these techniques can be combined effectively to influence player navigation without relying on explicit guidance systems such as objective markers or yellow paint.</w:t>
+            </w:r>
           </w:p>
           <w:p>
             <w:pPr>
               <w:spacing w:after="200"/>
             </w:pPr>
             <w:r>
-              <w:t xml:space="preserve"> </w:t>
+              <w:t>User testing will be conducted at the end of development to evaluate the effectiveness of each prototype. Players will be asked to navigate the environments while observations are recorded. Feedback questionnaires will also be used to gather data.</w:t>
             </w:r>
           </w:p>
           <w:p>
@@ -1593,24 +1634,13 @@
               <w:spacing w:after="200"/>
             </w:pPr>
             <w:r>
-              <w:t xml:space="preserve"> </w:t>
+              <w:t>This methodology is appropriate because the research question focuses on player navigation and environmental guidance, which are best investigated through the creation of playable prototypes. User testing will allow the effectiveness of different guidance techniques to be evaluated in practice, while the lit review will ensure the designs are informed by existing research and industry practice. This approach will generate both practical artefacts and evidence-based findings relevant to game design.</w:t>
             </w:r>
           </w:p>
           <w:p>
             <w:pPr>
               <w:spacing w:after="200"/>
             </w:pPr>
-            <w:r>
-              <w:t xml:space="preserve"> </w:t>
-            </w:r>
-          </w:p>
-          <w:p>
-            <w:pPr>
-              <w:spacing w:after="200"/>
-            </w:pPr>
-            <w:r>
-              <w:t xml:space="preserve"> </w:t>
-            </w:r>
           </w:p>
         </w:tc>
       </w:tr>
@@ -1805,8 +1835,6 @@
           <w:p>
             <w:pPr>
               <w:spacing w:before="60" w:after="60"/>
-            </w:pPr>
-            <w:r>
               <w:rPr>
                 <w:i/>
                 <w:iCs/>
@@ -1814,9 +1842,7 @@
                 <w:sz w:val="17"/>
                 <w:szCs w:val="17"/>
               </w:rPr>
-              <w:t xml:space="preserve">Identify any legal, social, ethical, or professional issues associated with your project. If a full ethics application is required, note its </w:t>
-            </w:r>
-            <w:proofErr w:type="gramStart"/>
+            </w:pPr>
             <w:r>
               <w:rPr>
                 <w:i/>
@@ -1825,9 +1851,9 @@
                 <w:sz w:val="17"/>
                 <w:szCs w:val="17"/>
               </w:rPr>
-              <w:t>current status</w:t>
-            </w:r>
-            <w:proofErr w:type="gramEnd"/>
+              <w:t xml:space="preserve">Identify any legal, social, ethical, or professional issues associated with your project. If a full ethics application is required, note its </w:t>
+            </w:r>
+            <w:proofErr w:type="gramStart"/>
             <w:r>
               <w:rPr>
                 <w:i/>
@@ -1836,39 +1862,65 @@
                 <w:sz w:val="17"/>
                 <w:szCs w:val="17"/>
               </w:rPr>
+              <w:t>current status</w:t>
+            </w:r>
+            <w:proofErr w:type="gramEnd"/>
+            <w:r>
+              <w:rPr>
+                <w:i/>
+                <w:iCs/>
+                <w:color w:val="888888"/>
+                <w:sz w:val="17"/>
+                <w:szCs w:val="17"/>
+              </w:rPr>
               <w:t>. If not, briefly explain why no significant ethical risks are present.</w:t>
             </w:r>
           </w:p>
           <w:p>
             <w:pPr>
+              <w:spacing w:before="60" w:after="60"/>
+            </w:pPr>
+          </w:p>
+          <w:p>
+            <w:pPr>
               <w:spacing w:after="200"/>
             </w:pPr>
             <w:r>
+              <w:lastRenderedPageBreak/>
               <w:t xml:space="preserve"> </w:t>
             </w:r>
+            <w:r>
+              <w:t xml:space="preserve">Accessibility – Ethical implications </w:t>
+            </w:r>
           </w:p>
           <w:p>
             <w:pPr>
               <w:spacing w:after="200"/>
             </w:pPr>
             <w:r>
+              <w:t xml:space="preserve"> Playtesting – Ethical implications </w:t>
+            </w:r>
+          </w:p>
+          <w:p>
+            <w:pPr>
+              <w:spacing w:after="200"/>
+            </w:pPr>
+            <w:r>
+              <w:t xml:space="preserve">GDPR / Data Protection act – Legal implications </w:t>
+            </w:r>
+          </w:p>
+          <w:p>
+            <w:pPr>
+              <w:spacing w:after="200"/>
+            </w:pPr>
+            <w:r>
               <w:t xml:space="preserve"> </w:t>
             </w:r>
             <w:r>
-              <w:t xml:space="preserve">Ethical concerns around user testing? </w:t>
-            </w:r>
-          </w:p>
-          <w:p>
-            <w:pPr>
-              <w:spacing w:after="200"/>
-            </w:pPr>
-          </w:p>
-          <w:p>
-            <w:pPr>
-              <w:spacing w:after="200"/>
-            </w:pPr>
-            <w:r>
-              <w:t xml:space="preserve"> </w:t>
+              <w:rPr>
+                <w:highlight w:val="red"/>
+              </w:rPr>
+              <w:t>ADD MORE</w:t>
             </w:r>
           </w:p>
           <w:p>
@@ -1899,7 +1951,6 @@
           <w:bCs/>
           <w:color w:val="FFFFFF"/>
         </w:rPr>
-        <w:lastRenderedPageBreak/>
         <w:t>7. Project plan</w:t>
       </w:r>
     </w:p>
@@ -3301,6 +3352,7 @@
                 <w:sz w:val="18"/>
                 <w:szCs w:val="18"/>
               </w:rPr>
+              <w:lastRenderedPageBreak/>
               <w:t>Proposed method</w:t>
             </w:r>
           </w:p>
@@ -3466,7 +3518,6 @@
                 <w:sz w:val="17"/>
                 <w:szCs w:val="17"/>
               </w:rPr>
-              <w:lastRenderedPageBreak/>
               <w:t>Why is this method appropriate for your artefact type and working practice? How will it be made accessible within your final submission?</w:t>
             </w:r>
           </w:p>
@@ -3503,14 +3554,6 @@
             </w:r>
             <w:r>
               <w:t xml:space="preserve">commit frequency. </w:t>
-            </w:r>
-          </w:p>
-          <w:p>
-            <w:pPr>
-              <w:spacing w:after="200"/>
-            </w:pPr>
-            <w:r>
-              <w:t xml:space="preserve"> </w:t>
             </w:r>
           </w:p>
           <w:p>
@@ -3661,7 +3704,16 @@
               <w:spacing w:after="200"/>
             </w:pPr>
             <w:r>
-              <w:t xml:space="preserve">I read your proposal, which has many good aspects. The research question seems well-defined, and the artefacts to be produced are ambitious (4 prototypes) but sensible. I do think that the primary form this research will take is a software product. You can write a written article if you want to, but I don’t think this is required. Rather, I would recommend that you do a more thorough lit review of the available articles on level design and player navigation (bearing in mind the thousands of results that this query returned from Google Scholar). Add a few of the most relevant sources that you find to your proposal </w:t>
+              <w:t xml:space="preserve">I read your proposal, which has many good aspects. The research question seems well-defined, and the artefacts to be produced are ambitious (4 prototypes) but sensible. I do think that the primary form this research will take is a software product. You can write a written article if you want to, but I don’t think this is required. Rather, I would recommend that you do a more </w:t>
+            </w:r>
+            <w:r>
+              <w:rPr>
+                <w:highlight w:val="yellow"/>
+              </w:rPr>
+              <w:t>thorough lit review of the available articles on level design and player navigation</w:t>
+            </w:r>
+            <w:r>
+              <w:t xml:space="preserve"> (bearing in mind the thousands of results that this query returned from Google Scholar). Add a few of the most relevant sources that you find to your proposal </w:t>
             </w:r>
             <w:proofErr w:type="gramStart"/>
             <w:r>
@@ -3717,6 +3769,7 @@
               <w:spacing w:after="200"/>
             </w:pPr>
             <w:r>
+              <w:lastRenderedPageBreak/>
               <w:t xml:space="preserve"> </w:t>
             </w:r>
           </w:p>
@@ -3824,12 +3877,12 @@
       </w:pPr>
     </w:p>
     <w:sectPr>
-      <w:headerReference w:type="even" r:id="rId8"/>
-      <w:headerReference w:type="default" r:id="rId9"/>
-      <w:footerReference w:type="even" r:id="rId10"/>
-      <w:footerReference w:type="default" r:id="rId11"/>
-      <w:headerReference w:type="first" r:id="rId12"/>
-      <w:footerReference w:type="first" r:id="rId13"/>
+      <w:headerReference w:type="even" r:id="rId9"/>
+      <w:headerReference w:type="default" r:id="rId10"/>
+      <w:footerReference w:type="even" r:id="rId11"/>
+      <w:footerReference w:type="default" r:id="rId12"/>
+      <w:headerReference w:type="first" r:id="rId13"/>
+      <w:footerReference w:type="first" r:id="rId14"/>
       <w:pgSz w:w="11906" w:h="16838"/>
       <w:pgMar w:top="1634" w:right="1134" w:bottom="1134" w:left="1134" w:header="708" w:footer="708" w:gutter="0"/>
       <w:cols w:space="720"/>

</xml_diff>